<commit_message>
Separate Mode 1 and Mode 2: full pipeline skips PR task-profile
Make org-analyser run exclude PR task-profile by default so Mode 1 is
everything except the classifier, and Mode 2 (pr-task-profile /
org-analyser pr-task-profile) is the only path that runs it. Update docs,
setup guide, and regression coverage for the new default.

Co-authored-by: Cursor <cursoragent@cursor.com>
</commit_message>
<xml_diff>
--- a/docs/Org_Analyser_Setup_Guide.docx
+++ b/docs/Org_Analyser_Setup_Guide.docx
@@ -236,7 +236,7 @@
                 <w:sz w:val="18"/>
                 <w:szCs w:val="18"/>
               </w:rPr>
-              <w:t xml:space="preserve">1. Full pipeline</w:t>
+              <w:t xml:space="preserve">1. Full pipeline (no task-profile)</w:t>
             </w:r>
           </w:p>
         </w:tc>
@@ -262,7 +262,7 @@
                 <w:sz w:val="18"/>
                 <w:szCs w:val="18"/>
               </w:rPr>
-              <w:t xml:space="preserve">org-analyser run — clones every repo and runs all phases (merged-PR counts, profiler, eval-kit, quality score, and PR task-profile last).</w:t>
+              <w:t xml:space="preserve">org-analyser run — clones every repo and runs merged-PR counts, profiler, eval-kit, and quality score. Does NOT run PR task-profile.</w:t>
             </w:r>
           </w:p>
         </w:tc>
@@ -316,7 +316,7 @@
                 <w:sz w:val="18"/>
                 <w:szCs w:val="18"/>
               </w:rPr>
-              <w:t xml:space="preserve">org-analyser pr-task-profile  OR  pr-task-profile — classifies every merged pull request with rules + AI. No clones, no profiler, no eval-kit. Faster when you only need the task-profile report.</w:t>
+              <w:t xml:space="preserve">org-analyser pr-task-profile  OR  pr-task-profile — classifies every merged pull request with rules + AI. No clones, no profiler, no eval-kit, no quality score.</w:t>
             </w:r>
           </w:p>
         </w:tc>
@@ -1445,7 +1445,7 @@
           <w:sz w:val="32"/>
           <w:szCs w:val="32"/>
         </w:rPr>
-        <w:t xml:space="preserve">Step 5a: Mode 1 — full pipeline</w:t>
+        <w:t xml:space="preserve">Step 5a: Mode 1 — full pipeline (everything except PR task-profile)</w:t>
       </w:r>
     </w:p>
     <w:p>
@@ -1462,7 +1462,7 @@
           <w:sz w:val="22"/>
           <w:szCs w:val="22"/>
         </w:rPr>
-        <w:t xml:space="preserve">Pick the example below that matches what you want to analyze, replace the &lt;placeholders&gt;, and run it. Each run can take anywhere from minutes to several hours depending on how many repositories there are. PR task-profile runs last automatically.</w:t>
+        <w:t xml:space="preserve">Pick the example below that matches what you want to analyze, replace the &lt;placeholders&gt;, and run it. Each run can take anywhere from minutes to several hours depending on how many repositories there are. This mode does not run PR task-profile — use Mode 2 for that.</w:t>
       </w:r>
     </w:p>
     <w:p>
@@ -1686,7 +1686,7 @@
           <w:sz w:val="20"/>
           <w:szCs w:val="20"/>
         </w:rPr>
-        <w:t xml:space="preserve">To skip only the PR task-profile phase (still run everything else), add --skip-pr-task-profile. To skip sealed quality scores, add --skip-quality-score.</w:t>
+        <w:t xml:space="preserve">Mode 1 already skips PR task-profile. To skip sealed quality scores as well, add --skip-quality-score. Only pass --no-skip-pr-task-profile if you deliberately want Mode 1 and Mode 2 glued into one run.</w:t>
       </w:r>
     </w:p>
     <w:p>

</xml_diff>